<commit_message>
Finalize IEEE Access readiness updates
</commit_message>
<xml_diff>
--- a/docs/Cover_Letter_IEEE_Access.docx
+++ b/docs/Cover_Letter_IEEE_Access.docx
@@ -101,7 +101,7 @@
           <w:sz w:val="22"/>
           <w:szCs w:val="22"/>
         </w:rPr>
-        <w:t xml:space="preserve">May 2025</w:t>
+        <w:t xml:space="preserve">May 26, 2026</w:t>
       </w:r>
     </w:p>
     <w:p>
@@ -220,7 +220,7 @@
           <w:sz w:val="22"/>
           <w:szCs w:val="22"/>
         </w:rPr>
-        <w:t xml:space="preserve">The proliferation of IoT devices has created distributed network environments increasingly targeted by sophisticated cyber attacks, yet existing federated intrusion detection systems lack mechanisms to identify and exclude malicious (Byzantine) participants that poison collaborative model training. This paper presents QI-FedDetect, which addresses this critical gap by integrating variational quantum circuit-inspired feature encoding with a Quantum Jensen-Shannon Divergence-based Byzantine Detection Module.</w:t>
+        <w:t xml:space="preserve">The proliferation of IoT devices has created distributed network environments increasingly targeted by sophisticated cyber attacks, yet existing federated intrusion detection systems lack mechanisms to identify and exclude malicious (Byzantine) participants that poison collaborative model training. This paper presents QI-FedDetect, which addresses this critical gap by integrating variational quantum circuit-inspired feature encoding with a direction-aware Quantum Jensen-Shannon Divergence-based Byzantine Detection Module.</w:t>
       </w:r>
     </w:p>
     <w:p>
@@ -288,7 +288,7 @@
           <w:sz w:val="22"/>
           <w:szCs w:val="22"/>
         </w:rPr>
-        <w:t xml:space="preserve">3.  Empirical evaluation on NSL-KDD and CICIDS2017, demonstrating Byzantine detection rates of 60.83% and 100% respectively, against 0% for FedAvg and FedProx baselines — the first such comparison in the federated IDS literature.</w:t>
+        <w:t xml:space="preserve">3.  Empirical evaluation on NSL-KDD and CICIDS2017, demonstrating Byzantine detection rates of 60.83% and 100% respectively, with explicit comparison against FedAvg, FedProx, Krum, Trimmed Mean, and FLTrust-style robust aggregation baselines.</w:t>
       </w:r>
     </w:p>
     <w:p>

</xml_diff>